<commit_message>
Supply the OLEQ reference Silvia gave in her comment
Berding et al. 2018, the Oldenburg Epistemic Beliefs Questionnaire from the
ZPID Open Test Archive. That closes the marker left when the study protocol
turned out to cite no source for it, and the instrument now carries its
proper name in the text and in the assessment schedule.

Four open markers left.
</commit_message>
<xml_diff>
--- a/paper_2026-09-01_clean.docx
+++ b/paper_2026-09-01_clean.docx
@@ -7596,32 +7596,30 @@
         <w:t xml:space="preserve">)</w:t>
       </w:r>
       <w:r>
-        <w:t xml:space="preserve">; the epistemic-beliefs questionnaire</w:t>
-      </w:r>
-      <w:r>
-        <w:t xml:space="preserve"> </w:t>
-      </w:r>
-      <w:r>
-        <w:rPr>
-          <w:color w:val="C00000"/>
-          <w:b/>
-        </w:rPr>
-        <w:t xml:space="preserve">[</w:t>
-      </w:r>
-      <w:r>
-        <w:rPr>
-          <w:color w:val="C00000"/>
-          <w:b/>
-          <w:smallCaps/>
-        </w:rPr>
-        <w:t xml:space="preserve">open</w:t>
-      </w:r>
-      <w:r>
-        <w:rPr>
-          <w:color w:val="C00000"/>
-          <w:b/>
-        </w:rPr>
-        <w:t xml:space="preserve">: no source for the OLEQ in the study protocol]</w:t>
+        <w:t xml:space="preserve">; the Oldenburg Epistemic Beliefs</w:t>
+      </w:r>
+      <w:r>
+        <w:t xml:space="preserve"> </w:t>
+      </w:r>
+      <w:r>
+        <w:t xml:space="preserve">Questionnaire</w:t>
+      </w:r>
+      <w:r>
+        <w:t xml:space="preserve"> </w:t>
+      </w:r>
+      <w:r>
+        <w:t xml:space="preserve">(</w:t>
+      </w:r>
+      <w:hyperlink w:anchor="ref-berding2018">
+        <w:r>
+          <w:rPr>
+            <w:rStyle w:val="Hyperlink"/>
+          </w:rPr>
+          <w:t xml:space="preserve">Berding et al. 2018</w:t>
+        </w:r>
+      </w:hyperlink>
+      <w:r>
+        <w:t xml:space="preserve">)</w:t>
       </w:r>
       <w:r>
         <w:t xml:space="preserve">; and the treatment</w:t>
@@ -8768,7 +8766,7 @@
               <w:jc w:val="left"/>
             </w:pPr>
             <w:r>
-              <w:t xml:space="preserve">Epistemic-beliefs questionnaire</w:t>
+              <w:t xml:space="preserve">Oldenburg Epistemic Beliefs Questionnaire</w:t>
             </w:r>
           </w:p>
         </w:tc>
@@ -17249,7 +17247,7 @@
       </w:r>
     </w:p>
     <w:bookmarkEnd w:id="61"/>
-    <w:bookmarkStart w:id="206" w:name="declarations"/>
+    <w:bookmarkStart w:id="208" w:name="declarations"/>
     <w:p>
       <w:pPr>
         <w:pStyle w:val="Heading1"/>
@@ -17776,7 +17774,7 @@
         <w:t xml:space="preserve">manuscript.</w:t>
       </w:r>
     </w:p>
-    <w:bookmarkStart w:id="205" w:name="refs"/>
+    <w:bookmarkStart w:id="207" w:name="refs"/>
     <w:bookmarkStart w:id="64" w:name="ref-adamczyk2016"/>
     <w:p>
       <w:pPr>
@@ -18287,7 +18285,79 @@
       </w:r>
     </w:p>
     <w:bookmarkEnd w:id="83"/>
-    <w:bookmarkStart w:id="85" w:name="ref-billot2024"/>
+    <w:bookmarkStart w:id="85" w:name="ref-berding2018"/>
+    <w:p>
+      <w:pPr>
+        <w:pStyle w:val="Bibliography"/>
+      </w:pPr>
+      <w:r>
+        <w:t xml:space="preserve">Berding, Florian, Manuela Paechter, Karin Rebmann, et al. 2018.</w:t>
+      </w:r>
+      <w:r>
+        <w:t xml:space="preserve"> </w:t>
+      </w:r>
+      <w:r>
+        <w:rPr>
+          <w:i/>
+          <w:iCs/>
+        </w:rPr>
+        <w:t xml:space="preserve">OLEQ</w:t>
+      </w:r>
+      <w:r>
+        <w:rPr>
+          <w:i/>
+          <w:iCs/>
+        </w:rPr>
+        <w:t xml:space="preserve">.</w:t>
+      </w:r>
+      <w:r>
+        <w:rPr>
+          <w:i/>
+          <w:iCs/>
+        </w:rPr>
+        <w:t xml:space="preserve"> </w:t>
+      </w:r>
+      <w:r>
+        <w:rPr>
+          <w:i/>
+          <w:iCs/>
+        </w:rPr>
+        <w:t xml:space="preserve">Oldenburg</w:t>
+      </w:r>
+      <w:r>
+        <w:rPr>
+          <w:i/>
+          <w:iCs/>
+        </w:rPr>
+        <w:t xml:space="preserve"> </w:t>
+      </w:r>
+      <w:r>
+        <w:rPr>
+          <w:i/>
+          <w:iCs/>
+        </w:rPr>
+        <w:t xml:space="preserve">Epistemic Beliefs Questionnaire [Verfahrensdokumentation Und Fragebogen]</w:t>
+      </w:r>
+      <w:r>
+        <w:t xml:space="preserve">. In Leibniz-Institut für Psychologie (ZPID) (Hrsg.), Open Test Archive; ZPID.</w:t>
+      </w:r>
+      <w:r>
+        <w:t xml:space="preserve"> </w:t>
+      </w:r>
+      <w:hyperlink r:id="rId84">
+        <w:r>
+          <w:rPr>
+            <w:rStyle w:val="Hyperlink"/>
+          </w:rPr>
+          <w:t xml:space="preserve">https://doi.org/10.23668/psycharchives.4519</w:t>
+        </w:r>
+      </w:hyperlink>
+      <w:r>
+        <w:t xml:space="preserve">.</w:t>
+      </w:r>
+    </w:p>
+    <w:bookmarkEnd w:id="85"/>
+    <w:bookmarkStart w:id="87" w:name="ref-billot2024"/>
     <w:p>
       <w:pPr>
         <w:pStyle w:val="Bibliography"/>
@@ -18320,7 +18390,7 @@
       <w:r>
         <w:t xml:space="preserve"> </w:t>
       </w:r>
-      <w:hyperlink r:id="rId84">
+      <w:hyperlink r:id="rId86">
         <w:r>
           <w:rPr>
             <w:rStyle w:val="Hyperlink"/>
@@ -18332,8 +18402,8 @@
         <w:t xml:space="preserve">.</w:t>
       </w:r>
     </w:p>
-    <w:bookmarkEnd w:id="85"/>
-    <w:bookmarkStart w:id="87" w:name="ref-vanbreukelen2018"/>
+    <w:bookmarkEnd w:id="87"/>
+    <w:bookmarkStart w:id="89" w:name="ref-vanbreukelen2018"/>
     <w:p>
       <w:pPr>
         <w:pStyle w:val="Bibliography"/>
@@ -18366,7 +18436,7 @@
       <w:r>
         <w:t xml:space="preserve"> </w:t>
       </w:r>
-      <w:hyperlink r:id="rId86">
+      <w:hyperlink r:id="rId88">
         <w:r>
           <w:rPr>
             <w:rStyle w:val="Hyperlink"/>
@@ -18378,8 +18448,8 @@
         <w:t xml:space="preserve">.</w:t>
       </w:r>
     </w:p>
-    <w:bookmarkEnd w:id="87"/>
-    <w:bookmarkStart w:id="89" w:name="ref-campbell2012"/>
+    <w:bookmarkEnd w:id="89"/>
+    <w:bookmarkStart w:id="91" w:name="ref-campbell2012"/>
     <w:p>
       <w:pPr>
         <w:pStyle w:val="Bibliography"/>
@@ -18421,7 +18491,7 @@
       <w:r>
         <w:t xml:space="preserve"> </w:t>
       </w:r>
-      <w:hyperlink r:id="rId88">
+      <w:hyperlink r:id="rId90">
         <w:r>
           <w:rPr>
             <w:rStyle w:val="Hyperlink"/>
@@ -18433,8 +18503,8 @@
         <w:t xml:space="preserve">.</w:t>
       </w:r>
     </w:p>
-    <w:bookmarkEnd w:id="89"/>
-    <w:bookmarkStart w:id="91" w:name="ref-campbell2005"/>
+    <w:bookmarkEnd w:id="91"/>
+    <w:bookmarkStart w:id="93" w:name="ref-campbell2005"/>
     <w:p>
       <w:pPr>
         <w:pStyle w:val="Bibliography"/>
@@ -18467,7 +18537,7 @@
       <w:r>
         <w:t xml:space="preserve"> </w:t>
       </w:r>
-      <w:hyperlink r:id="rId90">
+      <w:hyperlink r:id="rId92">
         <w:r>
           <w:rPr>
             <w:rStyle w:val="Hyperlink"/>
@@ -18479,8 +18549,8 @@
         <w:t xml:space="preserve">.</w:t>
       </w:r>
     </w:p>
-    <w:bookmarkEnd w:id="91"/>
-    <w:bookmarkStart w:id="93" w:name="ref-catley2013"/>
+    <w:bookmarkEnd w:id="93"/>
+    <w:bookmarkStart w:id="95" w:name="ref-catley2013"/>
     <w:p>
       <w:pPr>
         <w:pStyle w:val="Bibliography"/>
@@ -18519,7 +18589,7 @@
       <w:r>
         <w:t xml:space="preserve"> </w:t>
       </w:r>
-      <w:hyperlink r:id="rId92">
+      <w:hyperlink r:id="rId94">
         <w:r>
           <w:rPr>
             <w:rStyle w:val="Hyperlink"/>
@@ -18531,8 +18601,8 @@
         <w:t xml:space="preserve">.</w:t>
       </w:r>
     </w:p>
-    <w:bookmarkEnd w:id="93"/>
-    <w:bookmarkStart w:id="95" w:name="ref-chiarotto2016"/>
+    <w:bookmarkEnd w:id="95"/>
+    <w:bookmarkStart w:id="97" w:name="ref-chiarotto2016"/>
     <w:p>
       <w:pPr>
         <w:pStyle w:val="Bibliography"/>
@@ -18565,7 +18635,7 @@
       <w:r>
         <w:t xml:space="preserve"> </w:t>
       </w:r>
-      <w:hyperlink r:id="rId94">
+      <w:hyperlink r:id="rId96">
         <w:r>
           <w:rPr>
             <w:rStyle w:val="Hyperlink"/>
@@ -18577,8 +18647,8 @@
         <w:t xml:space="preserve">.</w:t>
       </w:r>
     </w:p>
-    <w:bookmarkEnd w:id="95"/>
-    <w:bookmarkStart w:id="97" w:name="ref-copas2021"/>
+    <w:bookmarkEnd w:id="97"/>
+    <w:bookmarkStart w:id="99" w:name="ref-copas2021"/>
     <w:p>
       <w:pPr>
         <w:pStyle w:val="Bibliography"/>
@@ -18611,7 +18681,7 @@
       <w:r>
         <w:t xml:space="preserve"> </w:t>
       </w:r>
-      <w:hyperlink r:id="rId96">
+      <w:hyperlink r:id="rId98">
         <w:r>
           <w:rPr>
             <w:rStyle w:val="Hyperlink"/>
@@ -18623,8 +18693,8 @@
         <w:t xml:space="preserve">.</w:t>
       </w:r>
     </w:p>
-    <w:bookmarkEnd w:id="97"/>
-    <w:bookmarkStart w:id="99" w:name="ref-darlow2014"/>
+    <w:bookmarkEnd w:id="99"/>
+    <w:bookmarkStart w:id="101" w:name="ref-darlow2014"/>
     <w:p>
       <w:pPr>
         <w:pStyle w:val="Bibliography"/>
@@ -18666,7 +18736,7 @@
       <w:r>
         <w:t xml:space="preserve"> </w:t>
       </w:r>
-      <w:hyperlink r:id="rId98">
+      <w:hyperlink r:id="rId100">
         <w:r>
           <w:rPr>
             <w:rStyle w:val="Hyperlink"/>
@@ -18678,8 +18748,8 @@
         <w:t xml:space="preserve">.</w:t>
       </w:r>
     </w:p>
-    <w:bookmarkEnd w:id="99"/>
-    <w:bookmarkStart w:id="101" w:name="ref-dieck2018"/>
+    <w:bookmarkEnd w:id="101"/>
+    <w:bookmarkStart w:id="103" w:name="ref-dieck2018"/>
     <w:p>
       <w:pPr>
         <w:pStyle w:val="Bibliography"/>
@@ -18718,7 +18788,7 @@
       <w:r>
         <w:t xml:space="preserve"> </w:t>
       </w:r>
-      <w:hyperlink r:id="rId100">
+      <w:hyperlink r:id="rId102">
         <w:r>
           <w:rPr>
             <w:rStyle w:val="Hyperlink"/>
@@ -18730,8 +18800,8 @@
         <w:t xml:space="preserve">.</w:t>
       </w:r>
     </w:p>
-    <w:bookmarkEnd w:id="101"/>
-    <w:bookmarkStart w:id="103" w:name="ref-ehrenbrusthoff2018"/>
+    <w:bookmarkEnd w:id="103"/>
+    <w:bookmarkStart w:id="105" w:name="ref-ehrenbrusthoff2018"/>
     <w:p>
       <w:pPr>
         <w:pStyle w:val="Bibliography"/>
@@ -18770,7 +18840,7 @@
       <w:r>
         <w:t xml:space="preserve"> </w:t>
       </w:r>
-      <w:hyperlink r:id="rId102">
+      <w:hyperlink r:id="rId104">
         <w:r>
           <w:rPr>
             <w:rStyle w:val="Hyperlink"/>
@@ -18782,8 +18852,8 @@
         <w:t xml:space="preserve">.</w:t>
       </w:r>
     </w:p>
-    <w:bookmarkEnd w:id="103"/>
-    <w:bookmarkStart w:id="105" w:name="ref-eldridge2006"/>
+    <w:bookmarkEnd w:id="105"/>
+    <w:bookmarkStart w:id="107" w:name="ref-eldridge2006"/>
     <w:p>
       <w:pPr>
         <w:pStyle w:val="Bibliography"/>
@@ -18816,7 +18886,7 @@
       <w:r>
         <w:t xml:space="preserve"> </w:t>
       </w:r>
-      <w:hyperlink r:id="rId104">
+      <w:hyperlink r:id="rId106">
         <w:r>
           <w:rPr>
             <w:rStyle w:val="Hyperlink"/>
@@ -18828,8 +18898,8 @@
         <w:t xml:space="preserve">.</w:t>
       </w:r>
     </w:p>
-    <w:bookmarkEnd w:id="105"/>
-    <w:bookmarkStart w:id="107" w:name="ref-eldridge2009"/>
+    <w:bookmarkEnd w:id="107"/>
+    <w:bookmarkStart w:id="109" w:name="ref-eldridge2009"/>
     <w:p>
       <w:pPr>
         <w:pStyle w:val="Bibliography"/>
@@ -18862,7 +18932,7 @@
       <w:r>
         <w:t xml:space="preserve"> </w:t>
       </w:r>
-      <w:hyperlink r:id="rId106">
+      <w:hyperlink r:id="rId108">
         <w:r>
           <w:rPr>
             <w:rStyle w:val="Hyperlink"/>
@@ -18874,8 +18944,8 @@
         <w:t xml:space="preserve">.</w:t>
       </w:r>
     </w:p>
-    <w:bookmarkEnd w:id="107"/>
-    <w:bookmarkStart w:id="109" w:name="ref-gamble2017"/>
+    <w:bookmarkEnd w:id="109"/>
+    <w:bookmarkStart w:id="111" w:name="ref-gamble2017"/>
     <w:p>
       <w:pPr>
         <w:pStyle w:val="Bibliography"/>
@@ -18908,7 +18978,7 @@
       <w:r>
         <w:t xml:space="preserve"> </w:t>
       </w:r>
-      <w:hyperlink r:id="rId108">
+      <w:hyperlink r:id="rId110">
         <w:r>
           <w:rPr>
             <w:rStyle w:val="Hyperlink"/>
@@ -18920,8 +18990,8 @@
         <w:t xml:space="preserve">.</w:t>
       </w:r>
     </w:p>
-    <w:bookmarkEnd w:id="109"/>
-    <w:bookmarkStart w:id="111" w:name="ref-hawker2011"/>
+    <w:bookmarkEnd w:id="111"/>
+    <w:bookmarkStart w:id="113" w:name="ref-hawker2011"/>
     <w:p>
       <w:pPr>
         <w:pStyle w:val="Bibliography"/>
@@ -18960,7 +19030,7 @@
       <w:r>
         <w:t xml:space="preserve"> </w:t>
       </w:r>
-      <w:hyperlink r:id="rId110">
+      <w:hyperlink r:id="rId112">
         <w:r>
           <w:rPr>
             <w:rStyle w:val="Hyperlink"/>
@@ -18972,8 +19042,8 @@
         <w:t xml:space="preserve">.</w:t>
       </w:r>
     </w:p>
-    <w:bookmarkEnd w:id="111"/>
-    <w:bookmarkStart w:id="113" w:name="ref-hayes2017"/>
+    <w:bookmarkEnd w:id="113"/>
+    <w:bookmarkStart w:id="115" w:name="ref-hayes2017"/>
     <w:p>
       <w:pPr>
         <w:pStyle w:val="Bibliography"/>
@@ -18997,7 +19067,7 @@
       <w:r>
         <w:t xml:space="preserve"> </w:t>
       </w:r>
-      <w:hyperlink r:id="rId112">
+      <w:hyperlink r:id="rId114">
         <w:r>
           <w:rPr>
             <w:rStyle w:val="Hyperlink"/>
@@ -19009,8 +19079,8 @@
         <w:t xml:space="preserve">.</w:t>
       </w:r>
     </w:p>
-    <w:bookmarkEnd w:id="113"/>
-    <w:bookmarkStart w:id="115" w:name="ref-heldmann2015"/>
+    <w:bookmarkEnd w:id="115"/>
+    <w:bookmarkStart w:id="117" w:name="ref-heldmann2015"/>
     <w:p>
       <w:pPr>
         <w:pStyle w:val="Bibliography"/>
@@ -19055,7 +19125,7 @@
       <w:r>
         <w:t xml:space="preserve"> </w:t>
       </w:r>
-      <w:hyperlink r:id="rId114">
+      <w:hyperlink r:id="rId116">
         <w:r>
           <w:rPr>
             <w:rStyle w:val="Hyperlink"/>
@@ -19067,8 +19137,8 @@
         <w:t xml:space="preserve">.</w:t>
       </w:r>
     </w:p>
-    <w:bookmarkEnd w:id="115"/>
-    <w:bookmarkStart w:id="117" w:name="ref-hemming2023"/>
+    <w:bookmarkEnd w:id="117"/>
+    <w:bookmarkStart w:id="119" w:name="ref-hemming2023"/>
     <w:p>
       <w:pPr>
         <w:pStyle w:val="Bibliography"/>
@@ -19101,7 +19171,7 @@
       <w:r>
         <w:t xml:space="preserve"> </w:t>
       </w:r>
-      <w:hyperlink r:id="rId116">
+      <w:hyperlink r:id="rId118">
         <w:r>
           <w:rPr>
             <w:rStyle w:val="Hyperlink"/>
@@ -19113,8 +19183,8 @@
         <w:t xml:space="preserve">.</w:t>
       </w:r>
     </w:p>
-    <w:bookmarkEnd w:id="117"/>
-    <w:bookmarkStart w:id="119" w:name="ref-hemming2021"/>
+    <w:bookmarkEnd w:id="119"/>
+    <w:bookmarkStart w:id="121" w:name="ref-hemming2021"/>
     <w:p>
       <w:pPr>
         <w:pStyle w:val="Bibliography"/>
@@ -19147,7 +19217,7 @@
       <w:r>
         <w:t xml:space="preserve"> </w:t>
       </w:r>
-      <w:hyperlink r:id="rId118">
+      <w:hyperlink r:id="rId120">
         <w:r>
           <w:rPr>
             <w:rStyle w:val="Hyperlink"/>
@@ -19159,8 +19229,8 @@
         <w:t xml:space="preserve">.</w:t>
       </w:r>
     </w:p>
-    <w:bookmarkEnd w:id="119"/>
-    <w:bookmarkStart w:id="121" w:name="ref-hemming2025sap"/>
+    <w:bookmarkEnd w:id="121"/>
+    <w:bookmarkStart w:id="123" w:name="ref-hemming2025sap"/>
     <w:p>
       <w:pPr>
         <w:pStyle w:val="Bibliography"/>
@@ -19193,7 +19263,7 @@
       <w:r>
         <w:t xml:space="preserve"> </w:t>
       </w:r>
-      <w:hyperlink r:id="rId120">
+      <w:hyperlink r:id="rId122">
         <w:r>
           <w:rPr>
             <w:rStyle w:val="Hyperlink"/>
@@ -19205,8 +19275,8 @@
         <w:t xml:space="preserve">.</w:t>
       </w:r>
     </w:p>
-    <w:bookmarkEnd w:id="121"/>
-    <w:bookmarkStart w:id="123" w:name="ref-hemming2017"/>
+    <w:bookmarkEnd w:id="123"/>
+    <w:bookmarkStart w:id="125" w:name="ref-hemming2017"/>
     <w:p>
       <w:pPr>
         <w:pStyle w:val="Bibliography"/>
@@ -19239,7 +19309,7 @@
       <w:r>
         <w:t xml:space="preserve"> </w:t>
       </w:r>
-      <w:hyperlink r:id="rId122">
+      <w:hyperlink r:id="rId124">
         <w:r>
           <w:rPr>
             <w:rStyle w:val="Hyperlink"/>
@@ -19251,8 +19321,8 @@
         <w:t xml:space="preserve">.</w:t>
       </w:r>
     </w:p>
-    <w:bookmarkEnd w:id="123"/>
-    <w:bookmarkStart w:id="125" w:name="ref-herdman2011"/>
+    <w:bookmarkEnd w:id="125"/>
+    <w:bookmarkStart w:id="127" w:name="ref-herdman2011"/>
     <w:p>
       <w:pPr>
         <w:pStyle w:val="Bibliography"/>
@@ -19294,7 +19364,7 @@
       <w:r>
         <w:t xml:space="preserve"> </w:t>
       </w:r>
-      <w:hyperlink r:id="rId124">
+      <w:hyperlink r:id="rId126">
         <w:r>
           <w:rPr>
             <w:rStyle w:val="Hyperlink"/>
@@ -19306,8 +19376,8 @@
         <w:t xml:space="preserve">.</w:t>
       </w:r>
     </w:p>
-    <w:bookmarkEnd w:id="125"/>
-    <w:bookmarkStart w:id="127" w:name="ref-hooper2018"/>
+    <w:bookmarkEnd w:id="127"/>
+    <w:bookmarkStart w:id="129" w:name="ref-hooper2018"/>
     <w:p>
       <w:pPr>
         <w:pStyle w:val="Bibliography"/>
@@ -19340,7 +19410,7 @@
       <w:r>
         <w:t xml:space="preserve"> </w:t>
       </w:r>
-      <w:hyperlink r:id="rId126">
+      <w:hyperlink r:id="rId128">
         <w:r>
           <w:rPr>
             <w:rStyle w:val="Hyperlink"/>
@@ -19352,8 +19422,8 @@
         <w:t xml:space="preserve">.</w:t>
       </w:r>
     </w:p>
-    <w:bookmarkEnd w:id="127"/>
-    <w:bookmarkStart w:id="129" w:name="ref-hooper2016"/>
+    <w:bookmarkEnd w:id="129"/>
+    <w:bookmarkStart w:id="131" w:name="ref-hooper2016"/>
     <w:p>
       <w:pPr>
         <w:pStyle w:val="Bibliography"/>
@@ -19386,7 +19456,7 @@
       <w:r>
         <w:t xml:space="preserve"> </w:t>
       </w:r>
-      <w:hyperlink r:id="rId128">
+      <w:hyperlink r:id="rId130">
         <w:r>
           <w:rPr>
             <w:rStyle w:val="Hyperlink"/>
@@ -19398,8 +19468,8 @@
         <w:t xml:space="preserve">.</w:t>
       </w:r>
     </w:p>
-    <w:bookmarkEnd w:id="129"/>
-    <w:bookmarkStart w:id="131" w:name="ref-hopewell2025"/>
+    <w:bookmarkEnd w:id="131"/>
+    <w:bookmarkStart w:id="133" w:name="ref-hopewell2025"/>
     <w:p>
       <w:pPr>
         <w:pStyle w:val="Bibliography"/>
@@ -19432,7 +19502,7 @@
       <w:r>
         <w:t xml:space="preserve"> </w:t>
       </w:r>
-      <w:hyperlink r:id="rId130">
+      <w:hyperlink r:id="rId132">
         <w:r>
           <w:rPr>
             <w:rStyle w:val="Hyperlink"/>
@@ -19444,8 +19514,8 @@
         <w:t xml:space="preserve">.</w:t>
       </w:r>
     </w:p>
-    <w:bookmarkEnd w:id="131"/>
-    <w:bookmarkStart w:id="133" w:name="ref-hurley2020"/>
+    <w:bookmarkEnd w:id="133"/>
+    <w:bookmarkStart w:id="135" w:name="ref-hurley2020"/>
     <w:p>
       <w:pPr>
         <w:pStyle w:val="Bibliography"/>
@@ -19484,7 +19554,7 @@
       <w:r>
         <w:t xml:space="preserve"> </w:t>
       </w:r>
-      <w:hyperlink r:id="rId132">
+      <w:hyperlink r:id="rId134">
         <w:r>
           <w:rPr>
             <w:rStyle w:val="Hyperlink"/>
@@ -19496,8 +19566,8 @@
         <w:t xml:space="preserve">.</w:t>
       </w:r>
     </w:p>
-    <w:bookmarkEnd w:id="133"/>
-    <w:bookmarkStart w:id="134" w:name="ref-ibrahim2000"/>
+    <w:bookmarkEnd w:id="135"/>
+    <w:bookmarkStart w:id="136" w:name="ref-ibrahim2000"/>
     <w:p>
       <w:pPr>
         <w:pStyle w:val="Bibliography"/>
@@ -19528,8 +19598,8 @@
         <w:t xml:space="preserve">15 (1): 46–60.</w:t>
       </w:r>
     </w:p>
-    <w:bookmarkEnd w:id="134"/>
-    <w:bookmarkStart w:id="135" w:name="ref-ich2019"/>
+    <w:bookmarkEnd w:id="136"/>
+    <w:bookmarkStart w:id="137" w:name="ref-ich2019"/>
     <w:p>
       <w:pPr>
         <w:pStyle w:val="Bibliography"/>
@@ -19572,8 +19642,8 @@
         <w:t xml:space="preserve">. ICH Harmonised Guideline, final version adopted 20 November 2019.</w:t>
       </w:r>
     </w:p>
-    <w:bookmarkEnd w:id="135"/>
-    <w:bookmarkStart w:id="137" w:name="ref-ivers2012"/>
+    <w:bookmarkEnd w:id="137"/>
+    <w:bookmarkStart w:id="139" w:name="ref-ivers2012"/>
     <w:p>
       <w:pPr>
         <w:pStyle w:val="Bibliography"/>
@@ -19606,7 +19676,7 @@
       <w:r>
         <w:t xml:space="preserve"> </w:t>
       </w:r>
-      <w:hyperlink r:id="rId136">
+      <w:hyperlink r:id="rId138">
         <w:r>
           <w:rPr>
             <w:rStyle w:val="Hyperlink"/>
@@ -19618,8 +19688,8 @@
         <w:t xml:space="preserve">.</w:t>
       </w:r>
     </w:p>
-    <w:bookmarkEnd w:id="137"/>
-    <w:bookmarkStart w:id="139" w:name="ref-kahan2012"/>
+    <w:bookmarkEnd w:id="139"/>
+    <w:bookmarkStart w:id="141" w:name="ref-kahan2012"/>
     <w:p>
       <w:pPr>
         <w:pStyle w:val="Bibliography"/>
@@ -19652,7 +19722,7 @@
       <w:r>
         <w:t xml:space="preserve"> </w:t>
       </w:r>
-      <w:hyperlink r:id="rId138">
+      <w:hyperlink r:id="rId140">
         <w:r>
           <w:rPr>
             <w:rStyle w:val="Hyperlink"/>
@@ -19664,8 +19734,8 @@
         <w:t xml:space="preserve">.</w:t>
       </w:r>
     </w:p>
-    <w:bookmarkEnd w:id="139"/>
-    <w:bookmarkStart w:id="141" w:name="ref-kahan2026"/>
+    <w:bookmarkEnd w:id="141"/>
+    <w:bookmarkStart w:id="143" w:name="ref-kahan2026"/>
     <w:p>
       <w:pPr>
         <w:pStyle w:val="Bibliography"/>
@@ -19719,7 +19789,7 @@
       <w:r>
         <w:t xml:space="preserve"> </w:t>
       </w:r>
-      <w:hyperlink r:id="rId140">
+      <w:hyperlink r:id="rId142">
         <w:r>
           <w:rPr>
             <w:rStyle w:val="Hyperlink"/>
@@ -19731,8 +19801,8 @@
         <w:t xml:space="preserve">.</w:t>
       </w:r>
     </w:p>
-    <w:bookmarkEnd w:id="141"/>
-    <w:bookmarkStart w:id="143" w:name="ref-kahan2016"/>
+    <w:bookmarkEnd w:id="143"/>
+    <w:bookmarkStart w:id="145" w:name="ref-kahan2016"/>
     <w:p>
       <w:pPr>
         <w:pStyle w:val="Bibliography"/>
@@ -19765,7 +19835,7 @@
       <w:r>
         <w:t xml:space="preserve"> </w:t>
       </w:r>
-      <w:hyperlink r:id="rId142">
+      <w:hyperlink r:id="rId144">
         <w:r>
           <w:rPr>
             <w:rStyle w:val="Hyperlink"/>
@@ -19777,8 +19847,8 @@
         <w:t xml:space="preserve">.</w:t>
       </w:r>
     </w:p>
-    <w:bookmarkEnd w:id="143"/>
-    <w:bookmarkStart w:id="145" w:name="ref-kahan2023"/>
+    <w:bookmarkEnd w:id="145"/>
+    <w:bookmarkStart w:id="147" w:name="ref-kahan2023"/>
     <w:p>
       <w:pPr>
         <w:pStyle w:val="Bibliography"/>
@@ -19811,7 +19881,7 @@
       <w:r>
         <w:t xml:space="preserve"> </w:t>
       </w:r>
-      <w:hyperlink r:id="rId144">
+      <w:hyperlink r:id="rId146">
         <w:r>
           <w:rPr>
             <w:rStyle w:val="Hyperlink"/>
@@ -19823,8 +19893,8 @@
         <w:t xml:space="preserve">.</w:t>
       </w:r>
     </w:p>
-    <w:bookmarkEnd w:id="145"/>
-    <w:bookmarkStart w:id="147" w:name="ref-kent2023"/>
+    <w:bookmarkEnd w:id="147"/>
+    <w:bookmarkStart w:id="149" w:name="ref-kent2023"/>
     <w:p>
       <w:pPr>
         <w:pStyle w:val="Bibliography"/>
@@ -19863,7 +19933,7 @@
       <w:r>
         <w:t xml:space="preserve"> </w:t>
       </w:r>
-      <w:hyperlink r:id="rId146">
+      <w:hyperlink r:id="rId148">
         <w:r>
           <w:rPr>
             <w:rStyle w:val="Hyperlink"/>
@@ -19875,8 +19945,8 @@
         <w:t xml:space="preserve">.</w:t>
       </w:r>
     </w:p>
-    <w:bookmarkEnd w:id="147"/>
-    <w:bookmarkStart w:id="149" w:name="ref-kenward1997"/>
+    <w:bookmarkEnd w:id="149"/>
+    <w:bookmarkStart w:id="151" w:name="ref-kenward1997"/>
     <w:p>
       <w:pPr>
         <w:pStyle w:val="Bibliography"/>
@@ -19909,7 +19979,7 @@
       <w:r>
         <w:t xml:space="preserve"> </w:t>
       </w:r>
-      <w:hyperlink r:id="rId148">
+      <w:hyperlink r:id="rId150">
         <w:r>
           <w:rPr>
             <w:rStyle w:val="Hyperlink"/>
@@ -19921,8 +19991,8 @@
         <w:t xml:space="preserve">.</w:t>
       </w:r>
     </w:p>
-    <w:bookmarkEnd w:id="149"/>
-    <w:bookmarkStart w:id="151" w:name="ref-king2023"/>
+    <w:bookmarkEnd w:id="151"/>
+    <w:bookmarkStart w:id="153" w:name="ref-king2023"/>
     <w:p>
       <w:pPr>
         <w:pStyle w:val="Bibliography"/>
@@ -19955,7 +20025,7 @@
       <w:r>
         <w:t xml:space="preserve"> </w:t>
       </w:r>
-      <w:hyperlink r:id="rId150">
+      <w:hyperlink r:id="rId152">
         <w:r>
           <w:rPr>
             <w:rStyle w:val="Hyperlink"/>
@@ -19967,8 +20037,8 @@
         <w:t xml:space="preserve">.</w:t>
       </w:r>
     </w:p>
-    <w:bookmarkEnd w:id="151"/>
-    <w:bookmarkStart w:id="153" w:name="ref-klar2004"/>
+    <w:bookmarkEnd w:id="153"/>
+    <w:bookmarkStart w:id="155" w:name="ref-klar2004"/>
     <w:p>
       <w:pPr>
         <w:pStyle w:val="Bibliography"/>
@@ -20001,7 +20071,7 @@
       <w:r>
         <w:t xml:space="preserve"> </w:t>
       </w:r>
-      <w:hyperlink r:id="rId152">
+      <w:hyperlink r:id="rId154">
         <w:r>
           <w:rPr>
             <w:rStyle w:val="Hyperlink"/>
@@ -20013,8 +20083,8 @@
         <w:t xml:space="preserve">.</w:t>
       </w:r>
     </w:p>
-    <w:bookmarkEnd w:id="153"/>
-    <w:bookmarkStart w:id="155" w:name="ref-korevaar2021"/>
+    <w:bookmarkEnd w:id="155"/>
+    <w:bookmarkStart w:id="157" w:name="ref-korevaar2021"/>
     <w:p>
       <w:pPr>
         <w:pStyle w:val="Bibliography"/>
@@ -20053,7 +20123,7 @@
       <w:r>
         <w:t xml:space="preserve"> </w:t>
       </w:r>
-      <w:hyperlink r:id="rId154">
+      <w:hyperlink r:id="rId156">
         <w:r>
           <w:rPr>
             <w:rStyle w:val="Hyperlink"/>
@@ -20065,8 +20135,8 @@
         <w:t xml:space="preserve">.</w:t>
       </w:r>
     </w:p>
-    <w:bookmarkEnd w:id="155"/>
-    <w:bookmarkStart w:id="157" w:name="ref-lang2015"/>
+    <w:bookmarkEnd w:id="157"/>
+    <w:bookmarkStart w:id="159" w:name="ref-lang2015"/>
     <w:p>
       <w:pPr>
         <w:pStyle w:val="Bibliography"/>
@@ -20123,7 +20193,7 @@
       <w:r>
         <w:t xml:space="preserve"> </w:t>
       </w:r>
-      <w:hyperlink r:id="rId156">
+      <w:hyperlink r:id="rId158">
         <w:r>
           <w:rPr>
             <w:rStyle w:val="Hyperlink"/>
@@ -20135,8 +20205,8 @@
         <w:t xml:space="preserve">.</w:t>
       </w:r>
     </w:p>
-    <w:bookmarkEnd w:id="157"/>
-    <w:bookmarkStart w:id="159" w:name="ref-leyrat2018"/>
+    <w:bookmarkEnd w:id="159"/>
+    <w:bookmarkStart w:id="161" w:name="ref-leyrat2018"/>
     <w:p>
       <w:pPr>
         <w:pStyle w:val="Bibliography"/>
@@ -20169,7 +20239,7 @@
       <w:r>
         <w:t xml:space="preserve"> </w:t>
       </w:r>
-      <w:hyperlink r:id="rId158">
+      <w:hyperlink r:id="rId160">
         <w:r>
           <w:rPr>
             <w:rStyle w:val="Hyperlink"/>
@@ -20181,8 +20251,8 @@
         <w:t xml:space="preserve">.</w:t>
       </w:r>
     </w:p>
-    <w:bookmarkEnd w:id="159"/>
-    <w:bookmarkStart w:id="160" w:name="ref-liang2000"/>
+    <w:bookmarkEnd w:id="161"/>
+    <w:bookmarkStart w:id="162" w:name="ref-liang2000"/>
     <w:p>
       <w:pPr>
         <w:pStyle w:val="Bibliography"/>
@@ -20213,8 +20283,8 @@
         <w:t xml:space="preserve">62 (1): 134–48.</w:t>
       </w:r>
     </w:p>
-    <w:bookmarkEnd w:id="160"/>
-    <w:bookmarkStart w:id="162" w:name="ref-luomajoki2007"/>
+    <w:bookmarkEnd w:id="162"/>
+    <w:bookmarkStart w:id="164" w:name="ref-luomajoki2007"/>
     <w:p>
       <w:pPr>
         <w:pStyle w:val="Bibliography"/>
@@ -20253,7 +20323,7 @@
       <w:r>
         <w:t xml:space="preserve"> </w:t>
       </w:r>
-      <w:hyperlink r:id="rId161">
+      <w:hyperlink r:id="rId163">
         <w:r>
           <w:rPr>
             <w:rStyle w:val="Hyperlink"/>
@@ -20265,8 +20335,8 @@
         <w:t xml:space="preserve">.</w:t>
       </w:r>
     </w:p>
-    <w:bookmarkEnd w:id="162"/>
-    <w:bookmarkStart w:id="164" w:name="ref-luomajoki2008"/>
+    <w:bookmarkEnd w:id="164"/>
+    <w:bookmarkStart w:id="166" w:name="ref-luomajoki2008"/>
     <w:p>
       <w:pPr>
         <w:pStyle w:val="Bibliography"/>
@@ -20305,7 +20375,7 @@
       <w:r>
         <w:t xml:space="preserve"> </w:t>
       </w:r>
-      <w:hyperlink r:id="rId163">
+      <w:hyperlink r:id="rId165">
         <w:r>
           <w:rPr>
             <w:rStyle w:val="Hyperlink"/>
@@ -20317,8 +20387,8 @@
         <w:t xml:space="preserve">.</w:t>
       </w:r>
     </w:p>
-    <w:bookmarkEnd w:id="164"/>
-    <w:bookmarkStart w:id="166" w:name="ref-mangels2009"/>
+    <w:bookmarkEnd w:id="166"/>
+    <w:bookmarkStart w:id="168" w:name="ref-mangels2009"/>
     <w:p>
       <w:pPr>
         <w:pStyle w:val="Bibliography"/>
@@ -20357,7 +20427,7 @@
       <w:r>
         <w:t xml:space="preserve"> </w:t>
       </w:r>
-      <w:hyperlink r:id="rId165">
+      <w:hyperlink r:id="rId167">
         <w:r>
           <w:rPr>
             <w:rStyle w:val="Hyperlink"/>
@@ -20369,8 +20439,8 @@
         <w:t xml:space="preserve">.</w:t>
       </w:r>
     </w:p>
-    <w:bookmarkEnd w:id="166"/>
-    <w:bookmarkStart w:id="168" w:name="ref-martin2016"/>
+    <w:bookmarkEnd w:id="168"/>
+    <w:bookmarkStart w:id="170" w:name="ref-martin2016"/>
     <w:p>
       <w:pPr>
         <w:pStyle w:val="Bibliography"/>
@@ -20415,7 +20485,7 @@
       <w:r>
         <w:t xml:space="preserve"> </w:t>
       </w:r>
-      <w:hyperlink r:id="rId167">
+      <w:hyperlink r:id="rId169">
         <w:r>
           <w:rPr>
             <w:rStyle w:val="Hyperlink"/>
@@ -20427,8 +20497,8 @@
         <w:t xml:space="preserve">.</w:t>
       </w:r>
     </w:p>
-    <w:bookmarkEnd w:id="168"/>
-    <w:bookmarkStart w:id="170" w:name="ref-moulton2004"/>
+    <w:bookmarkEnd w:id="170"/>
+    <w:bookmarkStart w:id="172" w:name="ref-moulton2004"/>
     <w:p>
       <w:pPr>
         <w:pStyle w:val="Bibliography"/>
@@ -20461,7 +20531,7 @@
       <w:r>
         <w:t xml:space="preserve"> </w:t>
       </w:r>
-      <w:hyperlink r:id="rId169">
+      <w:hyperlink r:id="rId171">
         <w:r>
           <w:rPr>
             <w:rStyle w:val="Hyperlink"/>
@@ -20473,8 +20543,8 @@
         <w:t xml:space="preserve">.</w:t>
       </w:r>
     </w:p>
-    <w:bookmarkEnd w:id="170"/>
-    <w:bookmarkStart w:id="172" w:name="ref-nilges2015"/>
+    <w:bookmarkEnd w:id="172"/>
+    <w:bookmarkStart w:id="174" w:name="ref-nilges2015"/>
     <w:p>
       <w:pPr>
         <w:pStyle w:val="Bibliography"/>
@@ -20519,7 +20589,7 @@
       <w:r>
         <w:t xml:space="preserve"> </w:t>
       </w:r>
-      <w:hyperlink r:id="rId171">
+      <w:hyperlink r:id="rId173">
         <w:r>
           <w:rPr>
             <w:rStyle w:val="Hyperlink"/>
@@ -20531,8 +20601,8 @@
         <w:t xml:space="preserve">.</w:t>
       </w:r>
     </w:p>
-    <w:bookmarkEnd w:id="172"/>
-    <w:bookmarkStart w:id="174" w:name="ref-rcore"/>
+    <w:bookmarkEnd w:id="174"/>
+    <w:bookmarkStart w:id="176" w:name="ref-rcore"/>
     <w:p>
       <w:pPr>
         <w:pStyle w:val="Bibliography"/>
@@ -20556,7 +20626,7 @@
       <w:r>
         <w:t xml:space="preserve"> </w:t>
       </w:r>
-      <w:hyperlink r:id="rId173">
+      <w:hyperlink r:id="rId175">
         <w:r>
           <w:rPr>
             <w:rStyle w:val="Hyperlink"/>
@@ -20568,8 +20638,8 @@
         <w:t xml:space="preserve">.</w:t>
       </w:r>
     </w:p>
-    <w:bookmarkEnd w:id="174"/>
-    <w:bookmarkStart w:id="176" w:name="ref-reilly1993"/>
+    <w:bookmarkEnd w:id="176"/>
+    <w:bookmarkStart w:id="178" w:name="ref-reilly1993"/>
     <w:p>
       <w:pPr>
         <w:pStyle w:val="Bibliography"/>
@@ -20608,7 +20678,7 @@
       <w:r>
         <w:t xml:space="preserve"> </w:t>
       </w:r>
-      <w:hyperlink r:id="rId175">
+      <w:hyperlink r:id="rId177">
         <w:r>
           <w:rPr>
             <w:rStyle w:val="Hyperlink"/>
@@ -20620,8 +20690,8 @@
         <w:t xml:space="preserve">.</w:t>
       </w:r>
     </w:p>
-    <w:bookmarkEnd w:id="176"/>
-    <w:bookmarkStart w:id="178" w:name="ref-richter2019"/>
+    <w:bookmarkEnd w:id="178"/>
+    <w:bookmarkStart w:id="180" w:name="ref-richter2019"/>
     <w:p>
       <w:pPr>
         <w:pStyle w:val="Bibliography"/>
@@ -20684,7 +20754,7 @@
       <w:r>
         <w:t xml:space="preserve"> </w:t>
       </w:r>
-      <w:hyperlink r:id="rId177">
+      <w:hyperlink r:id="rId179">
         <w:r>
           <w:rPr>
             <w:rStyle w:val="Hyperlink"/>
@@ -20696,8 +20766,8 @@
         <w:t xml:space="preserve">.</w:t>
       </w:r>
     </w:p>
-    <w:bookmarkEnd w:id="178"/>
-    <w:bookmarkStart w:id="180" w:name="ref-roland2000"/>
+    <w:bookmarkEnd w:id="180"/>
+    <w:bookmarkStart w:id="182" w:name="ref-roland2000"/>
     <w:p>
       <w:pPr>
         <w:pStyle w:val="Bibliography"/>
@@ -20754,7 +20824,7 @@
       <w:r>
         <w:t xml:space="preserve"> </w:t>
       </w:r>
-      <w:hyperlink r:id="rId179">
+      <w:hyperlink r:id="rId181">
         <w:r>
           <w:rPr>
             <w:rStyle w:val="Hyperlink"/>
@@ -20766,8 +20836,8 @@
         <w:t xml:space="preserve">.</w:t>
       </w:r>
     </w:p>
-    <w:bookmarkEnd w:id="180"/>
-    <w:bookmarkStart w:id="182" w:name="ref-rusu2014"/>
+    <w:bookmarkEnd w:id="182"/>
+    <w:bookmarkStart w:id="184" w:name="ref-rusu2014"/>
     <w:p>
       <w:pPr>
         <w:pStyle w:val="Bibliography"/>
@@ -20806,7 +20876,7 @@
       <w:r>
         <w:t xml:space="preserve"> </w:t>
       </w:r>
-      <w:hyperlink r:id="rId181">
+      <w:hyperlink r:id="rId183">
         <w:r>
           <w:rPr>
             <w:rStyle w:val="Hyperlink"/>
@@ -20818,8 +20888,8 @@
         <w:t xml:space="preserve">.</w:t>
       </w:r>
     </w:p>
-    <w:bookmarkEnd w:id="182"/>
-    <w:bookmarkStart w:id="184" w:name="ref-senn1994"/>
+    <w:bookmarkEnd w:id="184"/>
+    <w:bookmarkStart w:id="186" w:name="ref-senn1994"/>
     <w:p>
       <w:pPr>
         <w:pStyle w:val="Bibliography"/>
@@ -20852,7 +20922,7 @@
       <w:r>
         <w:t xml:space="preserve"> </w:t>
       </w:r>
-      <w:hyperlink r:id="rId183">
+      <w:hyperlink r:id="rId185">
         <w:r>
           <w:rPr>
             <w:rStyle w:val="Hyperlink"/>
@@ -20864,8 +20934,8 @@
         <w:t xml:space="preserve">.</w:t>
       </w:r>
     </w:p>
-    <w:bookmarkEnd w:id="184"/>
-    <w:bookmarkStart w:id="185" w:name="ref-spiegelhalter2001"/>
+    <w:bookmarkEnd w:id="186"/>
+    <w:bookmarkStart w:id="187" w:name="ref-spiegelhalter2001"/>
     <w:p>
       <w:pPr>
         <w:pStyle w:val="Bibliography"/>
@@ -20896,8 +20966,8 @@
         <w:t xml:space="preserve">20 (3): 435–52.</w:t>
       </w:r>
     </w:p>
-    <w:bookmarkEnd w:id="185"/>
-    <w:bookmarkStart w:id="186" w:name="ref-spiegelhalter1994"/>
+    <w:bookmarkEnd w:id="187"/>
+    <w:bookmarkStart w:id="188" w:name="ref-spiegelhalter1994"/>
     <w:p>
       <w:pPr>
         <w:pStyle w:val="Bibliography"/>
@@ -20928,8 +20998,8 @@
         <w:t xml:space="preserve">157 (3): 357–416.</w:t>
       </w:r>
     </w:p>
-    <w:bookmarkEnd w:id="186"/>
-    <w:bookmarkStart w:id="188" w:name="ref-taljaard2016"/>
+    <w:bookmarkEnd w:id="188"/>
+    <w:bookmarkStart w:id="190" w:name="ref-taljaard2016"/>
     <w:p>
       <w:pPr>
         <w:pStyle w:val="Bibliography"/>
@@ -20962,7 +21032,7 @@
       <w:r>
         <w:t xml:space="preserve"> </w:t>
       </w:r>
-      <w:hyperlink r:id="rId187">
+      <w:hyperlink r:id="rId189">
         <w:r>
           <w:rPr>
             <w:rStyle w:val="Hyperlink"/>
@@ -20974,8 +21044,8 @@
         <w:t xml:space="preserve">.</w:t>
       </w:r>
     </w:p>
-    <w:bookmarkEnd w:id="188"/>
-    <w:bookmarkStart w:id="190" w:name="ref-teerenstra2012"/>
+    <w:bookmarkEnd w:id="190"/>
+    <w:bookmarkStart w:id="192" w:name="ref-teerenstra2012"/>
     <w:p>
       <w:pPr>
         <w:pStyle w:val="Bibliography"/>
@@ -21008,7 +21078,7 @@
       <w:r>
         <w:t xml:space="preserve"> </w:t>
       </w:r>
-      <w:hyperlink r:id="rId189">
+      <w:hyperlink r:id="rId191">
         <w:r>
           <w:rPr>
             <w:rStyle w:val="Hyperlink"/>
@@ -21020,8 +21090,8 @@
         <w:t xml:space="preserve">.</w:t>
       </w:r>
     </w:p>
-    <w:bookmarkEnd w:id="190"/>
-    <w:bookmarkStart w:id="192" w:name="ref-turnerstokes2009"/>
+    <w:bookmarkEnd w:id="192"/>
+    <w:bookmarkStart w:id="194" w:name="ref-turnerstokes2009"/>
     <w:p>
       <w:pPr>
         <w:pStyle w:val="Bibliography"/>
@@ -21060,7 +21130,7 @@
       <w:r>
         <w:t xml:space="preserve"> </w:t>
       </w:r>
-      <w:hyperlink r:id="rId191">
+      <w:hyperlink r:id="rId193">
         <w:r>
           <w:rPr>
             <w:rStyle w:val="Hyperlink"/>
@@ -21072,8 +21142,8 @@
         <w:t xml:space="preserve">.</w:t>
       </w:r>
     </w:p>
-    <w:bookmarkEnd w:id="192"/>
-    <w:bookmarkStart w:id="194" w:name="ref-ukbeam2003"/>
+    <w:bookmarkEnd w:id="194"/>
+    <w:bookmarkStart w:id="196" w:name="ref-ukbeam2003"/>
     <w:p>
       <w:pPr>
         <w:pStyle w:val="Bibliography"/>
@@ -21121,7 +21191,7 @@
       <w:r>
         <w:t xml:space="preserve"> </w:t>
       </w:r>
-      <w:hyperlink r:id="rId193">
+      <w:hyperlink r:id="rId195">
         <w:r>
           <w:rPr>
             <w:rStyle w:val="Hyperlink"/>
@@ -21133,8 +21203,8 @@
         <w:t xml:space="preserve">.</w:t>
       </w:r>
     </w:p>
-    <w:bookmarkEnd w:id="194"/>
-    <w:bookmarkStart w:id="196" w:name="ref-ukbeam2004"/>
+    <w:bookmarkEnd w:id="196"/>
+    <w:bookmarkStart w:id="198" w:name="ref-ukbeam2004"/>
     <w:p>
       <w:pPr>
         <w:pStyle w:val="Bibliography"/>
@@ -21173,7 +21243,7 @@
       <w:r>
         <w:t xml:space="preserve"> </w:t>
       </w:r>
-      <w:hyperlink r:id="rId195">
+      <w:hyperlink r:id="rId197">
         <w:r>
           <w:rPr>
             <w:rStyle w:val="Hyperlink"/>
@@ -21185,8 +21255,8 @@
         <w:t xml:space="preserve">.</w:t>
       </w:r>
     </w:p>
-    <w:bookmarkEnd w:id="196"/>
-    <w:bookmarkStart w:id="198" w:name="ref-waelti2015"/>
+    <w:bookmarkEnd w:id="198"/>
+    <w:bookmarkStart w:id="200" w:name="ref-waelti2015"/>
     <w:p>
       <w:pPr>
         <w:pStyle w:val="Bibliography"/>
@@ -21219,7 +21289,7 @@
       <w:r>
         <w:t xml:space="preserve"> </w:t>
       </w:r>
-      <w:hyperlink r:id="rId197">
+      <w:hyperlink r:id="rId199">
         <w:r>
           <w:rPr>
             <w:rStyle w:val="Hyperlink"/>
@@ -21231,8 +21301,8 @@
         <w:t xml:space="preserve">.</w:t>
       </w:r>
     </w:p>
-    <w:bookmarkEnd w:id="198"/>
-    <w:bookmarkStart w:id="200" w:name="ref-wand2008"/>
+    <w:bookmarkEnd w:id="200"/>
+    <w:bookmarkStart w:id="202" w:name="ref-wand2008"/>
     <w:p>
       <w:pPr>
         <w:pStyle w:val="Bibliography"/>
@@ -21265,7 +21335,7 @@
       <w:r>
         <w:t xml:space="preserve"> </w:t>
       </w:r>
-      <w:hyperlink r:id="rId199">
+      <w:hyperlink r:id="rId201">
         <w:r>
           <w:rPr>
             <w:rStyle w:val="Hyperlink"/>
@@ -21277,8 +21347,8 @@
         <w:t xml:space="preserve">.</w:t>
       </w:r>
     </w:p>
-    <w:bookmarkEnd w:id="200"/>
-    <w:bookmarkStart w:id="202" w:name="ref-wasserstein2019"/>
+    <w:bookmarkEnd w:id="202"/>
+    <w:bookmarkStart w:id="204" w:name="ref-wasserstein2019"/>
     <w:p>
       <w:pPr>
         <w:pStyle w:val="Bibliography"/>
@@ -21328,7 +21398,7 @@
       <w:r>
         <w:t xml:space="preserve"> </w:t>
       </w:r>
-      <w:hyperlink r:id="rId201">
+      <w:hyperlink r:id="rId203">
         <w:r>
           <w:rPr>
             <w:rStyle w:val="Hyperlink"/>
@@ -21340,8 +21410,8 @@
         <w:t xml:space="preserve">.</w:t>
       </w:r>
     </w:p>
-    <w:bookmarkEnd w:id="202"/>
-    <w:bookmarkStart w:id="203" w:name="ref-westfall2020"/>
+    <w:bookmarkEnd w:id="204"/>
+    <w:bookmarkStart w:id="205" w:name="ref-westfall2020"/>
     <w:p>
       <w:pPr>
         <w:pStyle w:val="Bibliography"/>
@@ -21363,8 +21433,8 @@
         <w:t xml:space="preserve">. Chapman &amp; Hall/CRC.</w:t>
       </w:r>
     </w:p>
-    <w:bookmarkEnd w:id="203"/>
-    <w:bookmarkStart w:id="204" w:name="ref-wirz2026"/>
+    <w:bookmarkEnd w:id="205"/>
+    <w:bookmarkStart w:id="206" w:name="ref-wirz2026"/>
     <w:p>
       <w:pPr>
         <w:pStyle w:val="Bibliography"/>
@@ -21400,9 +21470,9 @@
         <w:t xml:space="preserve">.</w:t>
       </w:r>
     </w:p>
-    <w:bookmarkEnd w:id="204"/>
-    <w:bookmarkEnd w:id="205"/>
     <w:bookmarkEnd w:id="206"/>
+    <w:bookmarkEnd w:id="207"/>
+    <w:bookmarkEnd w:id="208"/>
     <w:sectPr>
       <w:footnotePr>
         <w:numRestart w:val="eachSect"/>

</xml_diff>